<commit_message>
content: MBA em Fullstack Development concluído + depoimentos traduzidos por idioma da página
- Remove "em andamento"/"in progress" do MBA no about (pt/en), llms.txt e CV (cv.html, cv.docx, PDF regenerado)
- Educação no docx: "In progress · Expected 2025" → "Completed · 2025"
- Depoimentos 100% PT na /pt e 100% EN na / (quotes, cargos e tags localizados)

Co-Authored-By: Claude Fable 5 <noreply@anthropic.com>
</commit_message>
<xml_diff>
--- a/public/cv.docx
+++ b/public/cv.docx
@@ -225,7 +225,7 @@
           <w:sz w:val="19"/>
           <w:szCs w:val="19"/>
         </w:rPr>
-        <w:t xml:space="preserve">Product Engineer with 15+ years building digital products end-to-end — from zero-to-one UX research and Figma prototypes through to production-ready React/TypeScript front-end code integrated with REST and GraphQL APIs. Uniquely positioned at the intersection of design systems, component architecture, and user-centered product thinking. Holds a B.Sc. in Systems Analysis &amp; Development and an MBA (in progress) in Fullstack Development, complemented by a background in Digital Design. 3+ years delivering front-end features in modern JavaScript stacks (React, Next.js, Node.js); 15 years of UX/UI design, usability research, interaction design, and design system leadership. Experienced in AI-assisted workflows, prompt engineering, and integrating LLM-powered features into product interfaces. Thrives in lean teams where a single engineer-designer can own the entire product surface — cutting delivery time, reducing handoff friction, and shipping higher-quality user experiences.</w:t>
+        <w:t xml:space="preserve">Product Engineer with 15+ years building digital products end-to-end — from zero-to-one UX research and Figma prototypes through to production-ready React/TypeScript front-end code integrated with REST and GraphQL APIs. Uniquely positioned at the intersection of design systems, component architecture, and user-centered product thinking. Holds a B.Sc. in Systems Analysis &amp; Development and an MBA in Fullstack Development, complemented by a background in Digital Design. 3+ years delivering front-end features in modern JavaScript stacks (React, Next.js, Node.js); 15 years of UX/UI design, usability research, interaction design, and design system leadership. Experienced in AI-assisted workflows, prompt engineering, and integrating LLM-powered features into product interfaces. Thrives in lean teams where a single engineer-designer can own the entire product surface — cutting delivery time, reducing handoff friction, and shipping higher-quality user experiences.</w:t>
       </w:r>
     </w:p>
     <w:p>
@@ -1208,7 +1208,7 @@
                 <w:sz w:val="18"/>
                 <w:szCs w:val="18"/>
               </w:rPr>
-              <w:t xml:space="preserve">In progress · Expected 2025</w:t>
+              <w:t xml:space="preserve">Completed · 2025</w:t>
             </w:r>
           </w:p>
         </w:tc>

</xml_diff>